<commit_message>
SOW v3: WattCoin origin, DeFi energy meter framing, start date Sept 14
Co-Authored-By: Claude Fable 5.1 <noreply@anthropic.com>
</commit_message>
<xml_diff>
--- a/docs/QWATT-Instawards-SOW.docx
+++ b/docs/QWATT-Instawards-SOW.docx
@@ -204,7 +204,7 @@
                 <w:sz w:val="20"/>
                 <w:szCs w:val="20"/>
               </w:rPr>
-              <w:t xml:space="preserve">QWATT — The Clean Token</w:t>
+              <w:t xml:space="preserve">QWATT (formerly WattCoin) — a DeFi energy meter</w:t>
             </w:r>
           </w:p>
         </w:tc>
@@ -612,7 +612,7 @@
                 <w:sz w:val="20"/>
                 <w:szCs w:val="20"/>
               </w:rPr>
-              <w:t xml:space="preserve">TBD</w:t>
+              <w:t xml:space="preserve">September 14, 2026</w:t>
             </w:r>
           </w:p>
         </w:tc>
@@ -744,7 +744,7 @@
           <w:sz w:val="22"/>
           <w:szCs w:val="22"/>
         </w:rPr>
-        <w:t xml:space="preserve">This Instaward focuses on delivering a meter-agnostic verification engine for renewable energy generation, with multi-party authorization on Stellar Testnet.</w:t>
+        <w:t xml:space="preserve">QWATT, formerly WattCoin, is a DeFi energy meter: a verification layer that turns metered renewable generation into independently verifiable records on Stellar. This Instaward focuses on delivering a meter-agnostic verification engine for that layer, with multi-party authorization on Stellar Testnet.</w:t>
       </w:r>
     </w:p>
     <w:p>

</xml_diff>

<commit_message>
SOW v3: seven-day live run replaces the dataset replay
Week 4 now ends with seven days of unattended anchoring on testnet
with fault injections, which cannot be staged after the fact. The
historical replay becomes a minutes-long scale test in week 2. Scope
trimmed to two register maps; phase-2 gate wiring deferred.

Co-Authored-By: Claude Fable 5.1 <noreply@anthropic.com>
</commit_message>
<xml_diff>
--- a/docs/QWATT-Instawards-SOW.docx
+++ b/docs/QWATT-Instawards-SOW.docx
@@ -772,7 +772,7 @@
           <w:sz w:val="22"/>
           <w:szCs w:val="22"/>
         </w:rPr>
-        <w:t xml:space="preserve">The result will be a fully demonstrable pilot where a reviewer with no access to the team can take any anchored batch, download its evidence, re-run the gates and confirm the on-chain hash — and where no single key, including the team’s, can write a record on its own.</w:t>
+        <w:t xml:space="preserve">The result will be a fully demonstrable pilot: seven consecutive days of unattended operation on Stellar Testnet, where a reviewer with no access to the team can take any anchored batch, download its evidence, re-run the gates and confirm the on-chain hash — and where no single key, including the team’s, can write a record on its own.</w:t>
       </w:r>
     </w:p>
     <w:p>
@@ -1023,7 +1023,7 @@
           <w:sz w:val="22"/>
           <w:szCs w:val="22"/>
         </w:rPr>
-        <w:t xml:space="preserve">Any Modbus, HTTP or CSV meter source will be able to feed the engine through configuration alone; every batch — accepted or rejected — will be published with its hash and reason; accepted batches will be anchored only when a proposer, an independent verifier and an off-team third signer agree; and a public reconciliation page will let anyone confirm the chain end-to-end from Horizon and the evidence feed.</w:t>
+        <w:t xml:space="preserve">Any Modbus, HTTP or CSV meter source will be able to feed the engine through configuration alone; every batch — accepted or rejected — will be published with its hash and reason; accepted batches will be anchored only when a proposer, an independent verifier and an off-team third signer agree; and the pipeline will run unattended for the final seven days of the sprint, with a public reconciliation page that lets anyone confirm the chain end-to-end from Horizon and the evidence feed.</w:t>
       </w:r>
     </w:p>
     <w:p>
@@ -1191,7 +1191,7 @@
           <w:sz w:val="22"/>
           <w:szCs w:val="22"/>
         </w:rPr>
-        <w:t xml:space="preserve">Three reference register maps: PZEM-017, EPEver Tracer series, generic single-phase AC meter</w:t>
+        <w:t xml:space="preserve">Two reference register maps: PZEM-017 and EPEver Tracer — the Phase 1 bench instruments</w:t>
       </w:r>
     </w:p>
     <w:p>
@@ -1435,7 +1435,7 @@
           <w:sz w:val="22"/>
           <w:szCs w:val="22"/>
         </w:rPr>
-        <w:t xml:space="preserve">Phase-2 batch gates (sun witness, ramp, chain, integrity) wired to the generated spec bindings</w:t>
+        <w:t xml:space="preserve">Scale test: one month of a public PV dataset (historical data — the replay runs in minutes) pushed through the batch pipeline to exercise chaining across thousands of intervals</w:t>
       </w:r>
     </w:p>
     <w:p>
@@ -1646,6 +1646,25 @@
     </w:p>
     <w:p>
       <w:pPr>
+        <w:pStyle w:val="ListParagraph"/>
+        <w:numPr>
+          <w:ilvl w:val="0"/>
+          <w:numId w:val="2"/>
+        </w:numPr>
+        <w:spacing w:after="40" w:before="0" w:line="276"/>
+      </w:pPr>
+      <w:r>
+        <w:rPr>
+          <w:rFonts w:ascii="Arial" w:cs="Arial" w:eastAsia="Arial" w:hAnsi="Arial"/>
+          <w:color w:val="000000"/>
+          <w:sz w:val="22"/>
+          <w:szCs w:val="22"/>
+        </w:rPr>
+        <w:t xml:space="preserve">Live run starts as soon as the first multisig batch anchors (target day 21, latest day 23)</w:t>
+      </w:r>
+    </w:p>
+    <w:p>
+      <w:pPr>
         <w:spacing w:after="80" w:before="0" w:line="276"/>
       </w:pPr>
     </w:p>
@@ -1719,7 +1738,7 @@
           <w:sz w:val="26"/>
           <w:szCs w:val="26"/>
         </w:rPr>
-        <w:t xml:space="preserve">Public Evidence Feed, Reconciliation &amp; Real-Data Validation</w:t>
+        <w:t xml:space="preserve">Public Evidence Feed, Reconciliation &amp; Seven-Day Live Run</w:t>
       </w:r>
     </w:p>
     <w:p>
@@ -1790,26 +1809,26 @@
           <w:sz w:val="22"/>
           <w:szCs w:val="22"/>
         </w:rPr>
-        <w:t xml:space="preserve">Replay of at least 30 days of a public PV generation dataset through the full pipeline on testnet</w:t>
-      </w:r>
-    </w:p>
-    <w:p>
-      <w:pPr>
-        <w:pStyle w:val="ListParagraph"/>
-        <w:numPr>
-          <w:ilvl w:val="0"/>
-          <w:numId w:val="2"/>
-        </w:numPr>
-        <w:spacing w:after="40" w:before="0" w:line="276"/>
-      </w:pPr>
-      <w:r>
-        <w:rPr>
-          <w:rFonts w:ascii="Arial" w:cs="Arial" w:eastAsia="Arial" w:hAnsi="Arial"/>
-          <w:color w:val="000000"/>
-          <w:sz w:val="22"/>
-          <w:szCs w:val="22"/>
-        </w:rPr>
-        <w:t xml:space="preserve">Replay of induced-fault fixtures (shaded sensor, disconnected meter, night injection, implausible ramp) — each must be rejected and logged</w:t>
+        <w:t xml:space="preserve">Seven-day unattended live run (days 23–30): the full pipeline anchoring every interval through the multisig at real-time pace, fed by the solar simulator and the CSV replay adapter</w:t>
+      </w:r>
+    </w:p>
+    <w:p>
+      <w:pPr>
+        <w:pStyle w:val="ListParagraph"/>
+        <w:numPr>
+          <w:ilvl w:val="0"/>
+          <w:numId w:val="2"/>
+        </w:numPr>
+        <w:spacing w:after="40" w:before="0" w:line="276"/>
+      </w:pPr>
+      <w:r>
+        <w:rPr>
+          <w:rFonts w:ascii="Arial" w:cs="Arial" w:eastAsia="Arial" w:hAnsi="Arial"/>
+          <w:color w:val="000000"/>
+          <w:sz w:val="22"/>
+          <w:szCs w:val="22"/>
+        </w:rPr>
+        <w:t xml:space="preserve">Fault injections during the live run (shaded sensor, disconnected meter, night injection, implausible ramp) — each must appear in the public rejection log with its reason</w:t>
       </w:r>
     </w:p>
     <w:p>
@@ -1866,7 +1885,7 @@
           <w:sz w:val="22"/>
           <w:szCs w:val="22"/>
         </w:rPr>
-        <w:t xml:space="preserve">Demo video</w:t>
+        <w:t xml:space="preserve">Short demo video</w:t>
       </w:r>
     </w:p>
     <w:p>
@@ -1902,7 +1921,7 @@
           <w:sz w:val="22"/>
           <w:szCs w:val="22"/>
         </w:rPr>
-        <w:t xml:space="preserve">Rather than asking reviewers to trust screenshots, the sprint ends with a page that recomputes the truth in the visitor’s browser and a rejection log that proves the gates bite.</w:t>
+        <w:t xml:space="preserve">Seven consecutive days of timestamped transactions cannot be staged after the fact. Rather than asking reviewers to trust screenshots, the sprint ends with a live record, a page that recomputes the truth in the visitor’s browser, and a rejection log that proves the gates bite.</w:t>
       </w:r>
     </w:p>
     <w:p>
@@ -2136,6 +2155,25 @@
     </w:p>
     <w:p>
       <w:pPr>
+        <w:pStyle w:val="ListParagraph"/>
+        <w:numPr>
+          <w:ilvl w:val="0"/>
+          <w:numId w:val="2"/>
+        </w:numPr>
+        <w:spacing w:after="40" w:before="0" w:line="276"/>
+      </w:pPr>
+      <w:r>
+        <w:rPr>
+          <w:rFonts w:ascii="Arial" w:cs="Arial" w:eastAsia="Arial" w:hAnsi="Arial"/>
+          <w:color w:val="000000"/>
+          <w:sz w:val="22"/>
+          <w:szCs w:val="22"/>
+        </w:rPr>
+        <w:t xml:space="preserve">Wiring the Phase-2 batch gates (sun witness, ramp, integrity) into the spec bindings — already implemented and tested; deferred to the next Instaward</w:t>
+      </w:r>
+    </w:p>
+    <w:p>
+      <w:pPr>
         <w:spacing w:after="80" w:before="0" w:line="276"/>
       </w:pPr>
     </w:p>
@@ -2562,7 +2600,7 @@
           <w:sz w:val="22"/>
           <w:szCs w:val="22"/>
         </w:rPr>
-        <w:t xml:space="preserve">Three reference register maps</w:t>
+        <w:t xml:space="preserve">Two reference register maps</w:t>
       </w:r>
     </w:p>
     <w:p>
@@ -2702,7 +2740,7 @@
           <w:sz w:val="22"/>
           <w:szCs w:val="22"/>
         </w:rPr>
-        <w:t xml:space="preserve">Phase-2 gates on the spec</w:t>
+        <w:t xml:space="preserve">Historical scale test (runs in minutes)</w:t>
       </w:r>
     </w:p>
     <w:p>
@@ -2847,6 +2885,20 @@
     </w:p>
     <w:p>
       <w:pPr>
+        <w:spacing w:after="100" w:before="0" w:line="276"/>
+      </w:pPr>
+      <w:r>
+        <w:rPr>
+          <w:rFonts w:ascii="Arial" w:cs="Arial" w:eastAsia="Arial" w:hAnsi="Arial"/>
+          <w:color w:val="000000"/>
+          <w:sz w:val="22"/>
+          <w:szCs w:val="22"/>
+        </w:rPr>
+        <w:t xml:space="preserve">Live run starts (target day 21)</w:t>
+      </w:r>
+    </w:p>
+    <w:p>
+      <w:pPr>
         <w:keepNext/>
         <w:spacing w:after="120" w:before="0" w:line="276"/>
       </w:pPr>
@@ -2873,7 +2925,7 @@
           <w:sz w:val="22"/>
           <w:szCs w:val="22"/>
         </w:rPr>
-        <w:t xml:space="preserve">The first 2-of-3 anchored batch on Stellar Testnet, with linked transactions proving a single signer cannot anchor.</w:t>
+        <w:t xml:space="preserve">The first 2-of-3 anchored batch on Stellar Testnet, with linked transactions proving a single signer cannot anchor, and the pipeline left running.</w:t>
       </w:r>
     </w:p>
     <w:p>
@@ -2940,7 +2992,7 @@
           <w:sz w:val="22"/>
           <w:szCs w:val="22"/>
         </w:rPr>
-        <w:t xml:space="preserve">30-day public dataset replay</w:t>
+        <w:t xml:space="preserve">Seven-day live run (days 23–30)</w:t>
       </w:r>
     </w:p>
     <w:p>
@@ -2954,7 +3006,7 @@
           <w:sz w:val="22"/>
           <w:szCs w:val="22"/>
         </w:rPr>
-        <w:t xml:space="preserve">Fault-fixture replay</w:t>
+        <w:t xml:space="preserve">Fault injections into the live run</w:t>
       </w:r>
     </w:p>
     <w:p>
@@ -3013,7 +3065,7 @@
           <w:sz w:val="22"/>
           <w:szCs w:val="22"/>
         </w:rPr>
-        <w:t xml:space="preserve">Complete public verification pipeline with a non-empty rejection log and a reconciliation page anyone can run.</w:t>
+        <w:t xml:space="preserve">Seven consecutive days of unattended anchoring on Stellar Testnet, a non-empty rejection log, and a reconciliation page anyone can run.</w:t>
       </w:r>
     </w:p>
     <w:p>
@@ -3110,7 +3162,7 @@
           <w:sz w:val="22"/>
           <w:szCs w:val="22"/>
         </w:rPr>
-        <w:t xml:space="preserve">Three register-map configuration files</w:t>
+        <w:t xml:space="preserve">Two register-map configuration files</w:t>
       </w:r>
     </w:p>
     <w:p>
@@ -3252,6 +3304,25 @@
           <w:sz w:val="22"/>
           <w:szCs w:val="22"/>
         </w:rPr>
+        <w:t xml:space="preserve">Scale-test output: an unbroken hash chain over one month of historical intervals</w:t>
+      </w:r>
+    </w:p>
+    <w:p>
+      <w:pPr>
+        <w:pStyle w:val="ListParagraph"/>
+        <w:numPr>
+          <w:ilvl w:val="0"/>
+          <w:numId w:val="2"/>
+        </w:numPr>
+        <w:spacing w:after="40" w:before="0" w:line="276"/>
+      </w:pPr>
+      <w:r>
+        <w:rPr>
+          <w:rFonts w:ascii="Arial" w:cs="Arial" w:eastAsia="Arial" w:hAnsi="Arial"/>
+          <w:color w:val="000000"/>
+          <w:sz w:val="22"/>
+          <w:szCs w:val="22"/>
+        </w:rPr>
         <w:t xml:space="preserve">Conformance suite run (CI link)</w:t>
       </w:r>
     </w:p>
@@ -3479,45 +3550,64 @@
           <w:sz w:val="22"/>
           <w:szCs w:val="22"/>
         </w:rPr>
-        <w:t xml:space="preserve">Replay write-up linking every transaction</w:t>
-      </w:r>
-    </w:p>
-    <w:p>
-      <w:pPr>
-        <w:pStyle w:val="ListParagraph"/>
-        <w:numPr>
-          <w:ilvl w:val="0"/>
-          <w:numId w:val="2"/>
-        </w:numPr>
-        <w:spacing w:after="40" w:before="0" w:line="276"/>
-      </w:pPr>
-      <w:r>
-        <w:rPr>
-          <w:rFonts w:ascii="Arial" w:cs="Arial" w:eastAsia="Arial" w:hAnsi="Arial"/>
-          <w:color w:val="000000"/>
-          <w:sz w:val="22"/>
-          <w:szCs w:val="22"/>
-        </w:rPr>
-        <w:t xml:space="preserve">Rejection log from fault fixtures</w:t>
-      </w:r>
-    </w:p>
-    <w:p>
-      <w:pPr>
-        <w:pStyle w:val="ListParagraph"/>
-        <w:numPr>
-          <w:ilvl w:val="0"/>
-          <w:numId w:val="2"/>
-        </w:numPr>
-        <w:spacing w:after="40" w:before="0" w:line="276"/>
-      </w:pPr>
-      <w:r>
-        <w:rPr>
-          <w:rFonts w:ascii="Arial" w:cs="Arial" w:eastAsia="Arial" w:hAnsi="Arial"/>
-          <w:color w:val="000000"/>
-          <w:sz w:val="22"/>
-          <w:szCs w:val="22"/>
-        </w:rPr>
-        <w:t xml:space="preserve">End-to-end demonstration video</w:t>
+        <w:t xml:space="preserve">Seven consecutive days of anchored testnet transactions (stellar.expert links)</w:t>
+      </w:r>
+    </w:p>
+    <w:p>
+      <w:pPr>
+        <w:pStyle w:val="ListParagraph"/>
+        <w:numPr>
+          <w:ilvl w:val="0"/>
+          <w:numId w:val="2"/>
+        </w:numPr>
+        <w:spacing w:after="40" w:before="0" w:line="276"/>
+      </w:pPr>
+      <w:r>
+        <w:rPr>
+          <w:rFonts w:ascii="Arial" w:cs="Arial" w:eastAsia="Arial" w:hAnsi="Arial"/>
+          <w:color w:val="000000"/>
+          <w:sz w:val="22"/>
+          <w:szCs w:val="22"/>
+        </w:rPr>
+        <w:t xml:space="preserve">Public rejection log showing the injected faults with reasons</w:t>
+      </w:r>
+    </w:p>
+    <w:p>
+      <w:pPr>
+        <w:pStyle w:val="ListParagraph"/>
+        <w:numPr>
+          <w:ilvl w:val="0"/>
+          <w:numId w:val="2"/>
+        </w:numPr>
+        <w:spacing w:after="40" w:before="0" w:line="276"/>
+      </w:pPr>
+      <w:r>
+        <w:rPr>
+          <w:rFonts w:ascii="Arial" w:cs="Arial" w:eastAsia="Arial" w:hAnsi="Arial"/>
+          <w:color w:val="000000"/>
+          <w:sz w:val="22"/>
+          <w:szCs w:val="22"/>
+        </w:rPr>
+        <w:t xml:space="preserve">Write-up linking every transaction</w:t>
+      </w:r>
+    </w:p>
+    <w:p>
+      <w:pPr>
+        <w:pStyle w:val="ListParagraph"/>
+        <w:numPr>
+          <w:ilvl w:val="0"/>
+          <w:numId w:val="2"/>
+        </w:numPr>
+        <w:spacing w:after="40" w:before="0" w:line="276"/>
+      </w:pPr>
+      <w:r>
+        <w:rPr>
+          <w:rFonts w:ascii="Arial" w:cs="Arial" w:eastAsia="Arial" w:hAnsi="Arial"/>
+          <w:color w:val="000000"/>
+          <w:sz w:val="22"/>
+          <w:szCs w:val="22"/>
+        </w:rPr>
+        <w:t xml:space="preserve">Short demonstration video</w:t>
       </w:r>
     </w:p>
     <w:p>
@@ -4128,7 +4218,7 @@
                 <w:sz w:val="20"/>
                 <w:szCs w:val="20"/>
               </w:rPr>
-              <w:t xml:space="preserve">Evidence Feed &amp; Validation</w:t>
+              <w:t xml:space="preserve">Evidence Feed &amp; Seven-Day Live Run</w:t>
             </w:r>
           </w:p>
         </w:tc>

</xml_diff>

<commit_message>
SOW v3: state the value created and the path to first users
Co-Authored-By: Claude Fable 5.1 <noreply@anthropic.com>
</commit_message>
<xml_diff>
--- a/docs/QWATT-Instawards-SOW.docx
+++ b/docs/QWATT-Instawards-SOW.docx
@@ -759,6 +759,20 @@
           <w:szCs w:val="22"/>
         </w:rPr>
         <w:t xml:space="preserve">Rather than building around one specific device, this sprint delivers a software layer that accepts the output of any standard energy meter — Modbus, HTTP/JSON or CSV — normalizes it to one record, runs it through open, versioned physics gates, and anchors the accepted evidence on Stellar through a 2-of-3 multisig in which an independent verifier re-runs every check from published data.</w:t>
+      </w:r>
+    </w:p>
+    <w:p>
+      <w:pPr>
+        <w:spacing w:after="160" w:before="0" w:line="276"/>
+      </w:pPr>
+      <w:r>
+        <w:rPr>
+          <w:rFonts w:ascii="Arial" w:cs="Arial" w:eastAsia="Arial" w:hAnsi="Arial"/>
+          <w:color w:val="000000"/>
+          <w:sz w:val="22"/>
+          <w:szCs w:val="22"/>
+        </w:rPr>
+        <w:t xml:space="preserve">The value this creates is simple: the cost of trusting a small generator’s claim falls to almost nothing. Today a building that shares one rooftop array, a client billed under a behind-the-meter PPA, or a registry issuing renewable attributes can only trust a small installation by sending a person or taking the owner’s word. A record anyone can check in a browser makes thousands of small roofs claimable and auditable as a class. The token stays what it is: a receipt for one verified megawatt-hour, minted only by physics and multi-party agreement, and consumed only when someone retires it to make a true claim.</w:t>
       </w:r>
     </w:p>
     <w:p>
@@ -4366,6 +4380,20 @@
     </w:p>
     <w:p>
       <w:pPr>
+        <w:spacing w:after="160" w:before="0" w:line="276"/>
+      </w:pPr>
+      <w:r>
+        <w:rPr>
+          <w:rFonts w:ascii="Arial" w:cs="Arial" w:eastAsia="Arial" w:hAnsi="Arial"/>
+          <w:color w:val="000000"/>
+          <w:sz w:val="22"/>
+          <w:szCs w:val="22"/>
+        </w:rPr>
+        <w:t xml:space="preserve">On the adoption side, and outside the scope of any grant, the verified record is what the team will take to its first users: a building that shares a rooftop array and pays a small monthly fee because the record ends a dispute it already has; a first redeemer that retires QWATT for a real, checkable claim; and one renewable-attribute registry or audit firm asked what a QWATT record must look like to be accepted. Those conversations, not the token, decide the next year of engineering.</w:t>
+      </w:r>
+    </w:p>
+    <w:p>
+      <w:pPr>
         <w:pBdr>
           <w:bottom w:val="single" w:color="999999" w:sz="6" w:space="1"/>
         </w:pBdr>

</xml_diff>

<commit_message>
Pre-flight audit of the repo against SOW v3; apply reviewer fixes
Answers the ten pre-flight questions from code and Horizon, estimates
about 200 founder hours by requirement, ranks blockers and gives a
day-by-day plan. SOW now separates publication from anchoring, defines
the batch record, lists test transactions A-D and the verifier
independence test, adds recovery logic before day 21, states the
200-hour plan against the 70 funded hours, and marks the two freezes.

Co-Authored-By: Claude Fable 5.1 <noreply@anthropic.com>
</commit_message>
<xml_diff>
--- a/docs/QWATT-Instawards-SOW.docx
+++ b/docs/QWATT-Instawards-SOW.docx
@@ -1037,7 +1037,7 @@
           <w:sz w:val="22"/>
           <w:szCs w:val="22"/>
         </w:rPr>
-        <w:t xml:space="preserve">Any Modbus, HTTP or CSV meter source will be able to feed the engine through configuration alone; every batch — accepted or rejected — will be published with its hash and reason; accepted batches will be anchored only when a proposer, an independent verifier and an off-team third signer agree; and the pipeline will run unattended for the final seven days of the sprint, with a public reconciliation page that lets anyone confirm the chain end-to-end from Horizon and the evidence feed.</w:t>
+        <w:t xml:space="preserve">Any Modbus, HTTP or CSV meter source will be able to feed the engine through configuration alone; every batch — accepted or rejected — will be published with its hash and reason; rejected batches are never anchored; accepted batches are anchored on Stellar only when a proposer, an independent verifier and an off-team third signer agree; and the pipeline will run unattended for the final seven days of the sprint, with a public reconciliation page that lets anyone confirm the chain end-to-end from Horizon and the evidence feed.</w:t>
       </w:r>
     </w:p>
     <w:p>
@@ -1354,26 +1354,45 @@
           <w:sz w:val="22"/>
           <w:szCs w:val="22"/>
         </w:rPr>
-        <w:t xml:space="preserve">Batch assembly from accepted intervals: canonical JSON, SHA-256, prev_hash chain, Merkle root over raw samples</w:t>
-      </w:r>
-    </w:p>
-    <w:p>
-      <w:pPr>
-        <w:pStyle w:val="ListParagraph"/>
-        <w:numPr>
-          <w:ilvl w:val="0"/>
-          <w:numId w:val="2"/>
-        </w:numPr>
-        <w:spacing w:after="40" w:before="0" w:line="276"/>
-      </w:pPr>
-      <w:r>
-        <w:rPr>
-          <w:rFonts w:ascii="Arial" w:cs="Arial" w:eastAsia="Arial" w:hAnsi="Arial"/>
-          <w:color w:val="000000"/>
-          <w:sz w:val="22"/>
-          <w:szCs w:val="22"/>
-        </w:rPr>
-        <w:t xml:space="preserve">Gate specification version stamped into every batch</w:t>
+        <w:t xml:space="preserve">Batch definition (batch.schema.json): batch id, start and end timestamps, interval count, accepted and rejected interval counts, schema version, gate specification version, previous batch hash, Merkle root over raw samples, cumulative energy, and the SHA-256 of the canonical JSON</w:t>
+      </w:r>
+    </w:p>
+    <w:p>
+      <w:pPr>
+        <w:pStyle w:val="ListParagraph"/>
+        <w:numPr>
+          <w:ilvl w:val="0"/>
+          <w:numId w:val="2"/>
+        </w:numPr>
+        <w:spacing w:after="40" w:before="0" w:line="276"/>
+      </w:pPr>
+      <w:r>
+        <w:rPr>
+          <w:rFonts w:ascii="Arial" w:cs="Arial" w:eastAsia="Arial" w:hAnsi="Arial"/>
+          <w:color w:val="000000"/>
+          <w:sz w:val="22"/>
+          <w:szCs w:val="22"/>
+        </w:rPr>
+        <w:t xml:space="preserve">Batch assembly: intervals → canonical JSON → SHA-256 → prev_hash chain; energies stored as integers so no floating-point value ever reaches a hash</w:t>
+      </w:r>
+    </w:p>
+    <w:p>
+      <w:pPr>
+        <w:pStyle w:val="ListParagraph"/>
+        <w:numPr>
+          <w:ilvl w:val="0"/>
+          <w:numId w:val="2"/>
+        </w:numPr>
+        <w:spacing w:after="40" w:before="0" w:line="276"/>
+      </w:pPr>
+      <w:r>
+        <w:rPr>
+          <w:rFonts w:ascii="Arial" w:cs="Arial" w:eastAsia="Arial" w:hAnsi="Arial"/>
+          <w:color w:val="000000"/>
+          <w:sz w:val="22"/>
+          <w:szCs w:val="22"/>
+        </w:rPr>
+        <w:t xml:space="preserve">Publication and anchoring are distinct: every batch, accepted or rejected, is published; only accepted batches are anchored on Stellar</w:t>
       </w:r>
     </w:p>
     <w:p>
@@ -1655,7 +1674,26 @@
           <w:sz w:val="22"/>
           <w:szCs w:val="22"/>
         </w:rPr>
-        <w:t xml:space="preserve">Negative tests: the proposer alone cannot anchor; a batch altered after the verifier’s read cannot anchor</w:t>
+        <w:t xml:space="preserve">Four published test transactions: (A) proposer signs alone — rejected by the network; (B) verifier signs alone — rejected; (C) proposer and verifier sign — anchored; (D) evidence altered after the verifier’s read — the verifier refuses and nothing anchors</w:t>
+      </w:r>
+    </w:p>
+    <w:p>
+      <w:pPr>
+        <w:pStyle w:val="ListParagraph"/>
+        <w:numPr>
+          <w:ilvl w:val="0"/>
+          <w:numId w:val="2"/>
+        </w:numPr>
+        <w:spacing w:after="40" w:before="0" w:line="276"/>
+      </w:pPr>
+      <w:r>
+        <w:rPr>
+          <w:rFonts w:ascii="Arial" w:cs="Arial" w:eastAsia="Arial" w:hAnsi="Arial"/>
+          <w:color w:val="000000"/>
+          <w:sz w:val="22"/>
+          <w:szCs w:val="22"/>
+        </w:rPr>
+        <w:t xml:space="preserve">Independence acceptance test: the verifier’s only input path is the public evidence feed — a batch the proposer holds but has not published cannot be signed</w:t>
       </w:r>
     </w:p>
     <w:p>
@@ -1785,7 +1823,7 @@
           <w:sz w:val="22"/>
           <w:szCs w:val="22"/>
         </w:rPr>
-        <w:t xml:space="preserve">Public evidence feed: every batch, accepted and rejected, with hash and reason</w:t>
+        <w:t xml:space="preserve">Public evidence feed: every batch, accepted and rejected, with hash and reason — published, while anchoring stays accepted-only</w:t>
       </w:r>
     </w:p>
     <w:p>
@@ -1805,6 +1843,25 @@
           <w:szCs w:val="22"/>
         </w:rPr>
         <w:t xml:space="preserve">Browser reconciliation page reading Horizon: anchored hashes ↔ published batches, cumulative totals, sequence gaps</w:t>
+      </w:r>
+    </w:p>
+    <w:p>
+      <w:pPr>
+        <w:pStyle w:val="ListParagraph"/>
+        <w:numPr>
+          <w:ilvl w:val="0"/>
+          <w:numId w:val="2"/>
+        </w:numPr>
+        <w:spacing w:after="40" w:before="0" w:line="276"/>
+      </w:pPr>
+      <w:r>
+        <w:rPr>
+          <w:rFonts w:ascii="Arial" w:cs="Arial" w:eastAsia="Arial" w:hAnsi="Arial"/>
+          <w:color w:val="000000"/>
+          <w:sz w:val="22"/>
+          <w:szCs w:val="22"/>
+        </w:rPr>
+        <w:t xml:space="preserve">Recovery logic in place before day 21: restart-safe state, Horizon timeouts and transaction retries, duplicate-interval rejection, clock checks, and safe behaviour when the verifier or a signer is unavailable</w:t>
       </w:r>
     </w:p>
     <w:p>
@@ -2244,7 +2301,7 @@
           <w:sz w:val="22"/>
           <w:szCs w:val="22"/>
         </w:rPr>
-        <w:t xml:space="preserve">The request is deliberately below the Instawards maximum. Both founders develop full time for the sprint, the gate specification and conformance suite are already shipped, and no hardware is needed. The award funds approximately 70 engineering hours at USD 35/h plus the operating items below; the remaining founder time is contributed.</w:t>
+        <w:t xml:space="preserve">The request is deliberately below the Instawards maximum. Both founders develop full time for the sprint, the gate specification and conformance suite are already shipped, and no hardware is needed. The team has planned the sprint at roughly 200 founder engineering hours; the award funds approximately 70 of them at USD 35/h plus the operating items below. The remaining hours are contributed.</w:t>
       </w:r>
     </w:p>
     <w:p>
@@ -2572,7 +2629,21 @@
           <w:sz w:val="22"/>
           <w:szCs w:val="22"/>
         </w:rPr>
-        <w:t xml:space="preserve">Modbus adapter with register-map configs</w:t>
+        <w:t xml:space="preserve">Days 1–3: architecture freeze — schemas, batch definition, hash rules, adapter and verifier interfaces, transaction format</w:t>
+      </w:r>
+    </w:p>
+    <w:p>
+      <w:pPr>
+        <w:spacing w:after="100" w:before="0" w:line="276"/>
+      </w:pPr>
+      <w:r>
+        <w:rPr>
+          <w:rFonts w:ascii="Arial" w:cs="Arial" w:eastAsia="Arial" w:hAnsi="Arial"/>
+          <w:color w:val="000000"/>
+          <w:sz w:val="22"/>
+          <w:szCs w:val="22"/>
+        </w:rPr>
+        <w:t xml:space="preserve">Days 4–7: Modbus adapter with register-map configs</w:t>
       </w:r>
     </w:p>
     <w:p>
@@ -2894,7 +2965,7 @@
           <w:sz w:val="22"/>
           <w:szCs w:val="22"/>
         </w:rPr>
-        <w:t xml:space="preserve">Negative tests</w:t>
+        <w:t xml:space="preserve">Test transactions A–D</w:t>
       </w:r>
     </w:p>
     <w:p>
@@ -2909,6 +2980,20 @@
           <w:szCs w:val="22"/>
         </w:rPr>
         <w:t xml:space="preserve">Live run starts (target day 21)</w:t>
+      </w:r>
+    </w:p>
+    <w:p>
+      <w:pPr>
+        <w:spacing w:after="100" w:before="0" w:line="276"/>
+      </w:pPr>
+      <w:r>
+        <w:rPr>
+          <w:rFonts w:ascii="Arial" w:cs="Arial" w:eastAsia="Arial" w:hAnsi="Arial"/>
+          <w:color w:val="000000"/>
+          <w:sz w:val="22"/>
+          <w:szCs w:val="22"/>
+        </w:rPr>
+        <w:t xml:space="preserve">Days 21–22: integration freeze — no new features; reliability, recovery, documentation</w:t>
       </w:r>
     </w:p>
     <w:p>
@@ -3006,7 +3091,7 @@
           <w:sz w:val="22"/>
           <w:szCs w:val="22"/>
         </w:rPr>
-        <w:t xml:space="preserve">Seven-day live run (days 23–30)</w:t>
+        <w:t xml:space="preserve">Seven-day live run (days 23–30) — architecture untouched; monitor, record, collect evidence</w:t>
       </w:r>
     </w:p>
     <w:p>
@@ -3441,7 +3526,26 @@
           <w:sz w:val="22"/>
           <w:szCs w:val="22"/>
         </w:rPr>
-        <w:t xml:space="preserve">Transaction attempts demonstrating single-signer rejection</w:t>
+        <w:t xml:space="preserve">The four test transactions A–D, each linked</w:t>
+      </w:r>
+    </w:p>
+    <w:p>
+      <w:pPr>
+        <w:pStyle w:val="ListParagraph"/>
+        <w:numPr>
+          <w:ilvl w:val="0"/>
+          <w:numId w:val="2"/>
+        </w:numPr>
+        <w:spacing w:after="40" w:before="0" w:line="276"/>
+      </w:pPr>
+      <w:r>
+        <w:rPr>
+          <w:rFonts w:ascii="Arial" w:cs="Arial" w:eastAsia="Arial" w:hAnsi="Arial"/>
+          <w:color w:val="000000"/>
+          <w:sz w:val="22"/>
+          <w:szCs w:val="22"/>
+        </w:rPr>
+        <w:t xml:space="preserve">Independence test log: an unpublished batch the verifier refused to sign</w:t>
       </w:r>
     </w:p>
     <w:p>

</xml_diff>